<commit_message>
Cambio de lineamientos SCM
</commit_message>
<xml_diff>
--- a/ICS_G14_Planificación_SCM.docx
+++ b/ICS_G14_Planificación_SCM.docx
@@ -227,6 +227,9 @@
               <w:spacing w:line="240" w:lineRule="auto"/>
             </w:pPr>
             <w:r>
+              <w:t xml:space="preserve">Entregable de </w:t>
+            </w:r>
+            <w:r>
               <w:t>Trabajo Práctico</w:t>
             </w:r>
           </w:p>
@@ -287,6 +290,9 @@
             </w:pPr>
             <w:r>
               <w:t>ICS_G14_4K2_2025/Trabajos Prácticos/</w:t>
+            </w:r>
+            <w:r>
+              <w:t>TP&lt;&lt;N&gt;&gt;/</w:t>
             </w:r>
           </w:p>
         </w:tc>
@@ -342,7 +348,10 @@
               <w:spacing w:line="240" w:lineRule="auto"/>
             </w:pPr>
             <w:r>
-              <w:t>Lineamientos para TIG</w:t>
+              <w:t>Archivo de c</w:t>
+            </w:r>
+            <w:r>
+              <w:t>ódigo de Trabajo Práctico</w:t>
             </w:r>
           </w:p>
         </w:tc>
@@ -369,7 +378,23 @@
               <w:spacing w:line="240" w:lineRule="auto"/>
             </w:pPr>
             <w:r>
-              <w:t>ICS_G14_TIG_Lineamientos.pdf</w:t>
+              <w:t>&lt;&lt;</w:t>
+            </w:r>
+            <w:proofErr w:type="spellStart"/>
+            <w:r>
+              <w:t>nombre_archivo</w:t>
+            </w:r>
+            <w:proofErr w:type="spellEnd"/>
+            <w:r>
+              <w:t>&gt;&gt;.&lt;&lt;</w:t>
+            </w:r>
+            <w:proofErr w:type="spellStart"/>
+            <w:r>
+              <w:t>ext</w:t>
+            </w:r>
+            <w:proofErr w:type="spellEnd"/>
+            <w:r>
+              <w:t>&gt;&gt;</w:t>
             </w:r>
           </w:p>
         </w:tc>
@@ -386,10 +411,20 @@
           <w:p>
             <w:pPr>
               <w:widowControl w:val="0"/>
-              <w:spacing w:line="240" w:lineRule="auto"/>
-            </w:pPr>
-            <w:r>
-              <w:t>ICS_G14_4K2_2025/Trabajos de Investigación/</w:t>
+              <w:pBdr>
+                <w:top w:val="nil"/>
+                <w:left w:val="nil"/>
+                <w:bottom w:val="nil"/>
+                <w:right w:val="nil"/>
+                <w:between w:val="nil"/>
+              </w:pBdr>
+              <w:spacing w:line="240" w:lineRule="auto"/>
+            </w:pPr>
+            <w:r>
+              <w:t>ICS_G14_4K2_2025/Trabajos Prácticos/TP&lt;&lt;N&gt;&gt;/</w:t>
+            </w:r>
+            <w:r>
+              <w:t>Código/</w:t>
             </w:r>
           </w:p>
         </w:tc>
@@ -416,7 +451,7 @@
               <w:spacing w:line="240" w:lineRule="auto"/>
             </w:pPr>
             <w:r>
-              <w:t>Documento</w:t>
+              <w:t>Práctico</w:t>
             </w:r>
           </w:p>
         </w:tc>
@@ -445,7 +480,7 @@
               <w:spacing w:line="240" w:lineRule="auto"/>
             </w:pPr>
             <w:r>
-              <w:t>Trabajo de Investigación Grupal</w:t>
+              <w:t>Archivo de documentación de Trabajo Práctico</w:t>
             </w:r>
           </w:p>
         </w:tc>
@@ -472,13 +507,24 @@
               <w:spacing w:line="240" w:lineRule="auto"/>
             </w:pPr>
             <w:r>
-              <w:t>ICS_G14_TIG_&lt;&lt;nombre&gt;&gt;.</w:t>
+              <w:t>&lt;&lt;</w:t>
             </w:r>
             <w:proofErr w:type="spellStart"/>
             <w:r>
-              <w:t>pdf</w:t>
+              <w:t>nombre_archivo</w:t>
             </w:r>
             <w:proofErr w:type="spellEnd"/>
+            <w:r>
+              <w:t>&gt;&gt;.&lt;&lt;</w:t>
+            </w:r>
+            <w:proofErr w:type="spellStart"/>
+            <w:r>
+              <w:t>ext</w:t>
+            </w:r>
+            <w:proofErr w:type="spellEnd"/>
+            <w:r>
+              <w:t>&gt;&gt;</w:t>
+            </w:r>
           </w:p>
         </w:tc>
         <w:tc>
@@ -494,10 +540,20 @@
           <w:p>
             <w:pPr>
               <w:widowControl w:val="0"/>
-              <w:spacing w:line="240" w:lineRule="auto"/>
-            </w:pPr>
-            <w:r>
-              <w:t>ICS_G14_4K2_2025/Trabajos de Investigación/</w:t>
+              <w:pBdr>
+                <w:top w:val="nil"/>
+                <w:left w:val="nil"/>
+                <w:bottom w:val="nil"/>
+                <w:right w:val="nil"/>
+                <w:between w:val="nil"/>
+              </w:pBdr>
+              <w:spacing w:line="240" w:lineRule="auto"/>
+            </w:pPr>
+            <w:r>
+              <w:t>ICS_G14_4K2_2025/Trabajos Prácticos/TP&lt;&lt;N&gt;&gt;/</w:t>
+            </w:r>
+            <w:r>
+              <w:t>Documentación/</w:t>
             </w:r>
           </w:p>
         </w:tc>
@@ -553,7 +609,7 @@
               <w:spacing w:line="240" w:lineRule="auto"/>
             </w:pPr>
             <w:r>
-              <w:t>Plan de Gestión de Configuración de Software</w:t>
+              <w:t>Lineamientos para TIG</w:t>
             </w:r>
           </w:p>
         </w:tc>
@@ -580,7 +636,7 @@
               <w:spacing w:line="240" w:lineRule="auto"/>
             </w:pPr>
             <w:r>
-              <w:t>ICS_G14_Planificación_SCM.docx</w:t>
+              <w:t>ICS_G14_TIG_Lineamientos.pdf</w:t>
             </w:r>
           </w:p>
         </w:tc>
@@ -600,7 +656,7 @@
               <w:spacing w:line="240" w:lineRule="auto"/>
             </w:pPr>
             <w:r>
-              <w:t>ICS_G14_4K2_2025/</w:t>
+              <w:t>ICS_G14_4K2_2025/Trabajos de Investigación/</w:t>
             </w:r>
           </w:p>
         </w:tc>
@@ -656,7 +712,7 @@
               <w:spacing w:line="240" w:lineRule="auto"/>
             </w:pPr>
             <w:r>
-              <w:t>Guía de Ejercicios Prácticos Resueltos</w:t>
+              <w:t>Trabajo de Investigación Grupal</w:t>
             </w:r>
           </w:p>
         </w:tc>
@@ -683,34 +739,13 @@
               <w:spacing w:line="240" w:lineRule="auto"/>
             </w:pPr>
             <w:r>
-              <w:t>ICS_G14_Guía_Ejercicios_Prácticos_Resueltos.pdf</w:t>
-            </w:r>
-          </w:p>
-          <w:p>
-            <w:pPr>
-              <w:widowControl w:val="0"/>
-              <w:pBdr>
-                <w:top w:val="nil"/>
-                <w:left w:val="nil"/>
-                <w:bottom w:val="nil"/>
-                <w:right w:val="nil"/>
-                <w:between w:val="nil"/>
-              </w:pBdr>
-              <w:spacing w:line="240" w:lineRule="auto"/>
-            </w:pPr>
-          </w:p>
-          <w:p>
-            <w:pPr>
-              <w:widowControl w:val="0"/>
-              <w:pBdr>
-                <w:top w:val="nil"/>
-                <w:left w:val="nil"/>
-                <w:bottom w:val="nil"/>
-                <w:right w:val="nil"/>
-                <w:between w:val="nil"/>
-              </w:pBdr>
-              <w:spacing w:line="240" w:lineRule="auto"/>
-            </w:pPr>
+              <w:t>ICS_G14_TIG_&lt;&lt;nombre&gt;&gt;.</w:t>
+            </w:r>
+            <w:proofErr w:type="spellStart"/>
+            <w:r>
+              <w:t>pdf</w:t>
+            </w:r>
+            <w:proofErr w:type="spellEnd"/>
           </w:p>
         </w:tc>
         <w:tc>
@@ -729,10 +764,7 @@
               <w:spacing w:line="240" w:lineRule="auto"/>
             </w:pPr>
             <w:r>
-              <w:t>ICS_G14_4K2_2025/Material Práctico</w:t>
-            </w:r>
-            <w:r>
-              <w:t>/</w:t>
+              <w:t>ICS_G14_4K2_2025/Trabajos de Investigación/</w:t>
             </w:r>
           </w:p>
         </w:tc>
@@ -788,7 +820,7 @@
               <w:spacing w:line="240" w:lineRule="auto"/>
             </w:pPr>
             <w:r>
-              <w:t>Guía de Trabajos Prácticos Evaluables</w:t>
+              <w:t>Plan de Gestión de Configuración de Software</w:t>
             </w:r>
           </w:p>
         </w:tc>
@@ -815,7 +847,7 @@
               <w:spacing w:line="240" w:lineRule="auto"/>
             </w:pPr>
             <w:r>
-              <w:t>ICS_G14_Guía_Ejercicios_Prácticos_Evaluables.pdf</w:t>
+              <w:t>ICS_G14_Planificación_SCM.docx</w:t>
             </w:r>
           </w:p>
         </w:tc>
@@ -835,7 +867,7 @@
               <w:spacing w:line="240" w:lineRule="auto"/>
             </w:pPr>
             <w:r>
-              <w:t>ICS_G14_4K2_2025/Material Práctico/</w:t>
+              <w:t>ICS_G14_4K2_2025/</w:t>
             </w:r>
           </w:p>
         </w:tc>
@@ -862,7 +894,7 @@
               <w:spacing w:line="240" w:lineRule="auto"/>
             </w:pPr>
             <w:r>
-              <w:t>Práctico</w:t>
+              <w:t>Documento</w:t>
             </w:r>
           </w:p>
         </w:tc>
@@ -890,13 +922,8 @@
               </w:pBdr>
               <w:spacing w:line="240" w:lineRule="auto"/>
             </w:pPr>
-            <w:proofErr w:type="spellStart"/>
-            <w:r>
-              <w:t>Template</w:t>
-            </w:r>
-            <w:proofErr w:type="spellEnd"/>
-            <w:r>
-              <w:t xml:space="preserve"> para Prácticos y Parciales</w:t>
+            <w:r>
+              <w:t>Guía de Ejercicios Prácticos Resueltos</w:t>
             </w:r>
           </w:p>
         </w:tc>
@@ -923,19 +950,34 @@
               <w:spacing w:line="240" w:lineRule="auto"/>
             </w:pPr>
             <w:r>
-              <w:t>ICS_G14_Template_&lt;&lt;nombre&gt;&gt;.</w:t>
-            </w:r>
-            <w:r>
-              <w:t>&lt;&lt;</w:t>
-            </w:r>
-            <w:proofErr w:type="spellStart"/>
-            <w:r>
-              <w:t>ext</w:t>
-            </w:r>
-            <w:proofErr w:type="spellEnd"/>
-            <w:r>
-              <w:t>&gt;&gt;</w:t>
-            </w:r>
+              <w:t>ICS_G14_Guía_Ejercicios_Prácticos_Resueltos.pdf</w:t>
+            </w:r>
+          </w:p>
+          <w:p>
+            <w:pPr>
+              <w:widowControl w:val="0"/>
+              <w:pBdr>
+                <w:top w:val="nil"/>
+                <w:left w:val="nil"/>
+                <w:bottom w:val="nil"/>
+                <w:right w:val="nil"/>
+                <w:between w:val="nil"/>
+              </w:pBdr>
+              <w:spacing w:line="240" w:lineRule="auto"/>
+            </w:pPr>
+          </w:p>
+          <w:p>
+            <w:pPr>
+              <w:widowControl w:val="0"/>
+              <w:pBdr>
+                <w:top w:val="nil"/>
+                <w:left w:val="nil"/>
+                <w:bottom w:val="nil"/>
+                <w:right w:val="nil"/>
+                <w:between w:val="nil"/>
+              </w:pBdr>
+              <w:spacing w:line="240" w:lineRule="auto"/>
+            </w:pPr>
           </w:p>
         </w:tc>
         <w:tc>
@@ -954,15 +996,10 @@
               <w:spacing w:line="240" w:lineRule="auto"/>
             </w:pPr>
             <w:r>
-              <w:t>ICS_G14_4K2_2025/Material Práctico/</w:t>
-            </w:r>
-            <w:proofErr w:type="spellStart"/>
-            <w:r>
-              <w:t>Templates</w:t>
-            </w:r>
-            <w:proofErr w:type="spellEnd"/>
-            <w:r>
-              <w:t xml:space="preserve"> para Prácticos y Parciales/</w:t>
+              <w:t>ICS_G14_4K2_2025/Material Práctico</w:t>
+            </w:r>
+            <w:r>
+              <w:t>/</w:t>
             </w:r>
           </w:p>
         </w:tc>
@@ -1018,7 +1055,7 @@
               <w:spacing w:line="240" w:lineRule="auto"/>
             </w:pPr>
             <w:r>
-              <w:t>Cronograma</w:t>
+              <w:t>Guía de Trabajos Prácticos Evaluables</w:t>
             </w:r>
           </w:p>
         </w:tc>
@@ -1045,7 +1082,7 @@
               <w:spacing w:line="240" w:lineRule="auto"/>
             </w:pPr>
             <w:r>
-              <w:t>ICS_G14_Cronograma_2025.xlsx</w:t>
+              <w:t>ICS_G14_Guía_Ejercicios_Prácticos_Evaluables.pdf</w:t>
             </w:r>
           </w:p>
         </w:tc>
@@ -1065,7 +1102,7 @@
               <w:spacing w:line="240" w:lineRule="auto"/>
             </w:pPr>
             <w:r>
-              <w:t>ICS_G14_4K2_2025/Planificación/</w:t>
+              <w:t>ICS_G14_4K2_2025/Material Práctico/</w:t>
             </w:r>
           </w:p>
         </w:tc>
@@ -1092,7 +1129,7 @@
               <w:spacing w:line="240" w:lineRule="auto"/>
             </w:pPr>
             <w:r>
-              <w:t>Documento</w:t>
+              <w:t>Práctico</w:t>
             </w:r>
           </w:p>
         </w:tc>
@@ -1120,7 +1157,238 @@
               </w:pBdr>
               <w:spacing w:line="240" w:lineRule="auto"/>
             </w:pPr>
-            <w:r>
+            <w:proofErr w:type="spellStart"/>
+            <w:r>
+              <w:t>Template</w:t>
+            </w:r>
+            <w:proofErr w:type="spellEnd"/>
+            <w:r>
+              <w:t xml:space="preserve"> para Prácticos y Parciales</w:t>
+            </w:r>
+          </w:p>
+        </w:tc>
+        <w:tc>
+          <w:tcPr>
+            <w:tcW w:w="3465" w:type="dxa"/>
+            <w:tcMar>
+              <w:top w:w="100" w:type="dxa"/>
+              <w:left w:w="100" w:type="dxa"/>
+              <w:bottom w:w="100" w:type="dxa"/>
+              <w:right w:w="100" w:type="dxa"/>
+            </w:tcMar>
+          </w:tcPr>
+          <w:p>
+            <w:pPr>
+              <w:widowControl w:val="0"/>
+              <w:pBdr>
+                <w:top w:val="nil"/>
+                <w:left w:val="nil"/>
+                <w:bottom w:val="nil"/>
+                <w:right w:val="nil"/>
+                <w:between w:val="nil"/>
+              </w:pBdr>
+              <w:spacing w:line="240" w:lineRule="auto"/>
+            </w:pPr>
+            <w:r>
+              <w:t>ICS_G14_Template_&lt;&lt;nombre&gt;&gt;.</w:t>
+            </w:r>
+            <w:r>
+              <w:t>&lt;&lt;</w:t>
+            </w:r>
+            <w:proofErr w:type="spellStart"/>
+            <w:r>
+              <w:t>ext</w:t>
+            </w:r>
+            <w:proofErr w:type="spellEnd"/>
+            <w:r>
+              <w:t>&gt;&gt;</w:t>
+            </w:r>
+          </w:p>
+        </w:tc>
+        <w:tc>
+          <w:tcPr>
+            <w:tcW w:w="1905" w:type="dxa"/>
+            <w:tcMar>
+              <w:top w:w="100" w:type="dxa"/>
+              <w:left w:w="100" w:type="dxa"/>
+              <w:bottom w:w="100" w:type="dxa"/>
+              <w:right w:w="100" w:type="dxa"/>
+            </w:tcMar>
+          </w:tcPr>
+          <w:p>
+            <w:pPr>
+              <w:widowControl w:val="0"/>
+              <w:spacing w:line="240" w:lineRule="auto"/>
+            </w:pPr>
+            <w:r>
+              <w:t>ICS_G14_4K2_2025/Material Práctico/</w:t>
+            </w:r>
+            <w:proofErr w:type="spellStart"/>
+            <w:r>
+              <w:t>Templates</w:t>
+            </w:r>
+            <w:proofErr w:type="spellEnd"/>
+            <w:r>
+              <w:t xml:space="preserve"> para Prácticos y Parciales/</w:t>
+            </w:r>
+          </w:p>
+        </w:tc>
+        <w:tc>
+          <w:tcPr>
+            <w:tcW w:w="1620" w:type="dxa"/>
+            <w:tcMar>
+              <w:top w:w="100" w:type="dxa"/>
+              <w:left w:w="100" w:type="dxa"/>
+              <w:bottom w:w="100" w:type="dxa"/>
+              <w:right w:w="100" w:type="dxa"/>
+            </w:tcMar>
+          </w:tcPr>
+          <w:p>
+            <w:pPr>
+              <w:widowControl w:val="0"/>
+              <w:pBdr>
+                <w:top w:val="nil"/>
+                <w:left w:val="nil"/>
+                <w:bottom w:val="nil"/>
+                <w:right w:val="nil"/>
+                <w:between w:val="nil"/>
+              </w:pBdr>
+              <w:spacing w:line="240" w:lineRule="auto"/>
+            </w:pPr>
+            <w:r>
+              <w:t>Práctico</w:t>
+            </w:r>
+          </w:p>
+        </w:tc>
+      </w:tr>
+      <w:tr>
+        <w:tc>
+          <w:tcPr>
+            <w:tcW w:w="2085" w:type="dxa"/>
+            <w:tcMar>
+              <w:top w:w="100" w:type="dxa"/>
+              <w:left w:w="100" w:type="dxa"/>
+              <w:bottom w:w="100" w:type="dxa"/>
+              <w:right w:w="100" w:type="dxa"/>
+            </w:tcMar>
+          </w:tcPr>
+          <w:p>
+            <w:pPr>
+              <w:widowControl w:val="0"/>
+              <w:pBdr>
+                <w:top w:val="nil"/>
+                <w:left w:val="nil"/>
+                <w:bottom w:val="nil"/>
+                <w:right w:val="nil"/>
+                <w:between w:val="nil"/>
+              </w:pBdr>
+              <w:spacing w:line="240" w:lineRule="auto"/>
+            </w:pPr>
+            <w:r>
+              <w:t>Cronograma</w:t>
+            </w:r>
+          </w:p>
+        </w:tc>
+        <w:tc>
+          <w:tcPr>
+            <w:tcW w:w="3465" w:type="dxa"/>
+            <w:tcMar>
+              <w:top w:w="100" w:type="dxa"/>
+              <w:left w:w="100" w:type="dxa"/>
+              <w:bottom w:w="100" w:type="dxa"/>
+              <w:right w:w="100" w:type="dxa"/>
+            </w:tcMar>
+          </w:tcPr>
+          <w:p>
+            <w:pPr>
+              <w:widowControl w:val="0"/>
+              <w:pBdr>
+                <w:top w:val="nil"/>
+                <w:left w:val="nil"/>
+                <w:bottom w:val="nil"/>
+                <w:right w:val="nil"/>
+                <w:between w:val="nil"/>
+              </w:pBdr>
+              <w:spacing w:line="240" w:lineRule="auto"/>
+            </w:pPr>
+            <w:r>
+              <w:t>ICS_G14_Cronograma_2025.xlsx</w:t>
+            </w:r>
+          </w:p>
+        </w:tc>
+        <w:tc>
+          <w:tcPr>
+            <w:tcW w:w="1905" w:type="dxa"/>
+            <w:tcMar>
+              <w:top w:w="100" w:type="dxa"/>
+              <w:left w:w="100" w:type="dxa"/>
+              <w:bottom w:w="100" w:type="dxa"/>
+              <w:right w:w="100" w:type="dxa"/>
+            </w:tcMar>
+          </w:tcPr>
+          <w:p>
+            <w:pPr>
+              <w:widowControl w:val="0"/>
+              <w:spacing w:line="240" w:lineRule="auto"/>
+            </w:pPr>
+            <w:r>
+              <w:t>ICS_G14_4K2_2025/Planificación/</w:t>
+            </w:r>
+          </w:p>
+        </w:tc>
+        <w:tc>
+          <w:tcPr>
+            <w:tcW w:w="1620" w:type="dxa"/>
+            <w:tcMar>
+              <w:top w:w="100" w:type="dxa"/>
+              <w:left w:w="100" w:type="dxa"/>
+              <w:bottom w:w="100" w:type="dxa"/>
+              <w:right w:w="100" w:type="dxa"/>
+            </w:tcMar>
+          </w:tcPr>
+          <w:p>
+            <w:pPr>
+              <w:widowControl w:val="0"/>
+              <w:pBdr>
+                <w:top w:val="nil"/>
+                <w:left w:val="nil"/>
+                <w:bottom w:val="nil"/>
+                <w:right w:val="nil"/>
+                <w:between w:val="nil"/>
+              </w:pBdr>
+              <w:spacing w:line="240" w:lineRule="auto"/>
+            </w:pPr>
+            <w:r>
+              <w:t>Documento</w:t>
+            </w:r>
+          </w:p>
+        </w:tc>
+      </w:tr>
+      <w:tr>
+        <w:tc>
+          <w:tcPr>
+            <w:tcW w:w="2085" w:type="dxa"/>
+            <w:tcMar>
+              <w:top w:w="100" w:type="dxa"/>
+              <w:left w:w="100" w:type="dxa"/>
+              <w:bottom w:w="100" w:type="dxa"/>
+              <w:right w:w="100" w:type="dxa"/>
+            </w:tcMar>
+          </w:tcPr>
+          <w:p>
+            <w:pPr>
+              <w:widowControl w:val="0"/>
+              <w:pBdr>
+                <w:top w:val="nil"/>
+                <w:left w:val="nil"/>
+                <w:bottom w:val="nil"/>
+                <w:right w:val="nil"/>
+                <w:between w:val="nil"/>
+              </w:pBdr>
+              <w:spacing w:line="240" w:lineRule="auto"/>
+            </w:pPr>
+            <w:r>
+              <w:lastRenderedPageBreak/>
               <w:t>Programa de la Materia</w:t>
             </w:r>
           </w:p>
@@ -1396,11 +1664,7 @@
               <w:spacing w:line="240" w:lineRule="auto"/>
             </w:pPr>
             <w:r>
-              <w:t>ICS_G14_4K2_2025/Material Teórico/Presenta</w:t>
-            </w:r>
-            <w:r>
-              <w:lastRenderedPageBreak/>
-              <w:t>ciones de Clase/</w:t>
+              <w:t>ICS_G14_4K2_2025/Material Teórico/Presentaciones de Clase/</w:t>
             </w:r>
           </w:p>
         </w:tc>
@@ -1427,7 +1691,6 @@
               <w:spacing w:line="240" w:lineRule="auto"/>
             </w:pPr>
             <w:r>
-              <w:lastRenderedPageBreak/>
               <w:t>Teórico</w:t>
             </w:r>
           </w:p>
@@ -2023,11 +2286,65 @@
       </w:r>
     </w:p>
     <w:p>
-      <w:r>
-        <w:tab/>
-      </w:r>
-      <w:r>
-        <w:tab/>
+      <w:pPr>
+        <w:rPr>
+          <w:b/>
+          <w:bCs/>
+        </w:rPr>
+      </w:pPr>
+      <w:r>
+        <w:rPr>
+          <w:b/>
+          <w:bCs/>
+        </w:rPr>
+        <w:tab/>
+      </w:r>
+      <w:r>
+        <w:rPr>
+          <w:b/>
+          <w:bCs/>
+        </w:rPr>
+        <w:tab/>
+        <w:t>TP</w:t>
+      </w:r>
+      <w:r>
+        <w:rPr>
+          <w:b/>
+          <w:bCs/>
+        </w:rPr>
+        <w:t>&lt;&lt;</w:t>
+      </w:r>
+      <w:r>
+        <w:rPr>
+          <w:b/>
+          <w:bCs/>
+        </w:rPr>
+        <w:t>N</w:t>
+      </w:r>
+      <w:r>
+        <w:rPr>
+          <w:b/>
+          <w:bCs/>
+        </w:rPr>
+        <w:t>&gt;&gt;/</w:t>
+      </w:r>
+    </w:p>
+    <w:p>
+      <w:pPr>
+        <w:rPr>
+          <w:u w:val="single"/>
+        </w:rPr>
+      </w:pPr>
+      <w:r>
+        <w:tab/>
+      </w:r>
+      <w:r>
+        <w:tab/>
+      </w:r>
+      <w:r>
+        <w:tab/>
+      </w:r>
+      <w:r>
         <w:t>ICS_G14_TP_&lt;&lt;N&gt;&gt;.</w:t>
       </w:r>
       <w:proofErr w:type="spellStart"/>
@@ -2035,6 +2352,134 @@
         <w:t>pdf</w:t>
       </w:r>
       <w:proofErr w:type="spellEnd"/>
+    </w:p>
+    <w:p>
+      <w:pPr>
+        <w:rPr>
+          <w:b/>
+          <w:bCs/>
+        </w:rPr>
+      </w:pPr>
+      <w:r>
+        <w:tab/>
+      </w:r>
+      <w:r>
+        <w:tab/>
+      </w:r>
+      <w:r>
+        <w:tab/>
+      </w:r>
+      <w:r>
+        <w:rPr>
+          <w:b/>
+          <w:bCs/>
+        </w:rPr>
+        <w:t>Código/</w:t>
+      </w:r>
+    </w:p>
+    <w:p>
+      <w:r>
+        <w:rPr>
+          <w:b/>
+          <w:bCs/>
+        </w:rPr>
+        <w:tab/>
+      </w:r>
+      <w:r>
+        <w:rPr>
+          <w:b/>
+          <w:bCs/>
+        </w:rPr>
+        <w:tab/>
+      </w:r>
+      <w:r>
+        <w:rPr>
+          <w:b/>
+          <w:bCs/>
+        </w:rPr>
+        <w:tab/>
+      </w:r>
+      <w:r>
+        <w:rPr>
+          <w:b/>
+          <w:bCs/>
+        </w:rPr>
+        <w:tab/>
+      </w:r>
+      <w:r>
+        <w:t>&lt;&lt;</w:t>
+      </w:r>
+      <w:proofErr w:type="spellStart"/>
+      <w:r>
+        <w:t>nombre_archivo</w:t>
+      </w:r>
+      <w:proofErr w:type="spellEnd"/>
+      <w:r>
+        <w:t>&gt;&gt;.&lt;&lt;</w:t>
+      </w:r>
+      <w:proofErr w:type="spellStart"/>
+      <w:r>
+        <w:t>ext</w:t>
+      </w:r>
+      <w:proofErr w:type="spellEnd"/>
+      <w:r>
+        <w:t>&gt;&gt;</w:t>
+      </w:r>
+    </w:p>
+    <w:p>
+      <w:pPr>
+        <w:rPr>
+          <w:b/>
+          <w:bCs/>
+        </w:rPr>
+      </w:pPr>
+      <w:r>
+        <w:tab/>
+      </w:r>
+      <w:r>
+        <w:tab/>
+      </w:r>
+      <w:r>
+        <w:tab/>
+      </w:r>
+      <w:r>
+        <w:rPr>
+          <w:b/>
+          <w:bCs/>
+        </w:rPr>
+        <w:t>Documentación/</w:t>
+      </w:r>
+    </w:p>
+    <w:p>
+      <w:r>
+        <w:tab/>
+      </w:r>
+      <w:r>
+        <w:tab/>
+      </w:r>
+      <w:r>
+        <w:tab/>
+      </w:r>
+      <w:r>
+        <w:tab/>
+        <w:t>&lt;&lt;</w:t>
+      </w:r>
+      <w:proofErr w:type="spellStart"/>
+      <w:r>
+        <w:t>nombre_archivo</w:t>
+      </w:r>
+      <w:proofErr w:type="spellEnd"/>
+      <w:r>
+        <w:t>&gt;&gt;.&lt;&lt;</w:t>
+      </w:r>
+      <w:proofErr w:type="spellStart"/>
+      <w:r>
+        <w:t>ext</w:t>
+      </w:r>
+      <w:proofErr w:type="spellEnd"/>
+      <w:r>
+        <w:t>&gt;&gt;</w:t>
+      </w:r>
     </w:p>
     <w:p>
       <w:pPr>

</xml_diff>

<commit_message>
cambio regla de nombrado de trabajos practicos
</commit_message>
<xml_diff>
--- a/ICS_G14_Planificación_SCM.docx
+++ b/ICS_G14_Planificación_SCM.docx
@@ -4,6 +4,7 @@
   <w:body>
     <w:p>
       <w:pPr>
+        <w:ind w:firstLine="720"/>
         <w:jc w:val="center"/>
         <w:rPr>
           <w:b/>
@@ -254,13 +255,13 @@
               <w:spacing w:line="240" w:lineRule="auto"/>
             </w:pPr>
             <w:r>
-              <w:t>ICS_G14_TP_&lt;&lt;N&gt;&gt;.</w:t>
-            </w:r>
-            <w:proofErr w:type="spellStart"/>
-            <w:r>
-              <w:t>pdf</w:t>
-            </w:r>
-            <w:proofErr w:type="spellEnd"/>
+              <w:t>ICS_G14_TP_&lt;&lt;N&gt;&gt;</w:t>
+            </w:r>
+            <w:r>
+              <w:t>.&lt;&lt;ext&gt;&gt;</w:t>
+            </w:r>
+            <w:bookmarkStart w:id="0" w:name="_GoBack"/>
+            <w:bookmarkEnd w:id="0"/>
           </w:p>
         </w:tc>
         <w:tc>
@@ -811,10 +812,7 @@
               <w:spacing w:line="240" w:lineRule="auto"/>
             </w:pPr>
             <w:r>
-              <w:t xml:space="preserve">Plan de Gestión de </w:t>
-            </w:r>
-            <w:r>
-              <w:t>Configuración de Software</w:t>
+              <w:t>Plan de Gestión de Configuración de Software</w:t>
             </w:r>
           </w:p>
         </w:tc>
@@ -1049,10 +1047,7 @@
               <w:spacing w:line="240" w:lineRule="auto"/>
             </w:pPr>
             <w:r>
-              <w:t xml:space="preserve">Guía de Trabajos Prácticos </w:t>
-            </w:r>
-            <w:r>
-              <w:t>Evaluables</w:t>
+              <w:t>Guía de Trabajos Prácticos Evaluables</w:t>
             </w:r>
           </w:p>
         </w:tc>
@@ -1329,7 +1324,11 @@
               <w:spacing w:line="240" w:lineRule="auto"/>
             </w:pPr>
             <w:r>
-              <w:t>ICS_G14_4K2_2025/Planificación/</w:t>
+              <w:t>ICS_G14_4K2_2025/Planificación</w:t>
+            </w:r>
+            <w:r>
+              <w:lastRenderedPageBreak/>
+              <w:t>/</w:t>
             </w:r>
           </w:p>
         </w:tc>
@@ -1356,6 +1355,7 @@
               <w:spacing w:line="240" w:lineRule="auto"/>
             </w:pPr>
             <w:r>
+              <w:lastRenderedPageBreak/>
               <w:t>Documento</w:t>
             </w:r>
           </w:p>
@@ -2053,8 +2053,6 @@
             </w:r>
           </w:p>
         </w:tc>
-        <w:bookmarkStart w:id="0" w:name="_GoBack"/>
-        <w:bookmarkEnd w:id="0"/>
       </w:tr>
     </w:tbl>
     <w:p>
@@ -2621,6 +2619,7 @@
         </w:rPr>
       </w:pPr>
       <w:r>
+        <w:lastRenderedPageBreak/>
         <w:tab/>
       </w:r>
       <w:r>
@@ -2642,7 +2641,6 @@
     </w:p>
     <w:p>
       <w:r>
-        <w:lastRenderedPageBreak/>
         <w:tab/>
       </w:r>
       <w:r>
@@ -2711,15 +2709,7 @@
           <w:sz w:val="24"/>
           <w:szCs w:val="24"/>
         </w:rPr>
-        <w:t xml:space="preserve">Criterio de actualización de Línea </w:t>
-      </w:r>
-      <w:r>
-        <w:rPr>
-          <w:b/>
-          <w:sz w:val="24"/>
-          <w:szCs w:val="24"/>
-        </w:rPr>
-        <w:t>Base:</w:t>
+        <w:t>Criterio de actualización de Línea Base:</w:t>
       </w:r>
     </w:p>
     <w:p>
@@ -2736,10 +2726,7 @@
         <w:jc w:val="both"/>
       </w:pPr>
       <w:r>
-        <w:t>La línea base se actualizará cada vez que se reciba una corrección de un trabajo práctico evaluable por parte de los profesores de la cátedra. En ese momento, se consolidará una nueva línea base del repositorio completo, de modo que quede registrado</w:t>
-      </w:r>
-      <w:r>
-        <w:t xml:space="preserve"> no solo el estado corregido de los trabajos prácticos, sino también el material teórico y práctico vigente en esa fecha. Cada línea base será identificada de forma incremental (LB1, LB2, …).</w:t>
+        <w:t>La línea base se actualizará cada vez que se reciba una corrección de un trabajo práctico evaluable por parte de los profesores de la cátedra. En ese momento, se consolidará una nueva línea base del repositorio completo, de modo que quede registrado no solo el estado corregido de los trabajos prácticos, sino también el material teórico y práctico vigente en esa fecha. Cada línea base será identificada de forma incremental (LB1, LB2, …).</w:t>
       </w:r>
     </w:p>
     <w:sectPr>

</xml_diff>